<commit_message>
docs: share chatbot benchmark results and routing
</commit_message>
<xml_diff>
--- a/scripts/benchmark_chatbot/Registro_de_Testes_do_Chatbot_comparativo_revisado.docx
+++ b/scripts/benchmark_chatbot/Registro_de_Testes_do_Chatbot_comparativo_revisado.docx
@@ -15,16 +15,12 @@
         <w:spacing w:after="160"/>
       </w:pPr>
       <w:r>
-        <w:rPr>
-          <w:color w:val="606775"/>
-          <w:sz w:val="20"/>
-        </w:rPr>
-        <w:t>Casa Lorenzi  |  Benchmark Gemini e Groq  |  Atualizado em 27/10/2026</w:t>
+        <w:t>Casa Lorenzi  |  Benchmark Gemini, Groq e Gemma  |  Atualizado em 27/10/2026</w:t>
       </w:r>
     </w:p>
     <w:p>
       <w:r>
-        <w:t>Conclusao ate agora: Gemini concluiu 12 casos baseline e 12 com ferramentas; as 12 chamadas de ferramenta esperadas foram identificadas. Duas respostas marcadas como falha automatica foram consideradas aceitaveis na revisao manual. Groq concluiu 12 casos baseline e 11 com ferramentas; a rodada parou em HTTP 429. Foi uma execucao por caso, portanto a comparacao e preliminar e nao estatistica.</w:t>
+        <w:t>Conclusao ate agora: Gemini e Groq mantem os resultados historicos descritos abaixo. O piloto do Gemma teve muitas falhas tecnicas: 7/12 casos baseline e 1/12 casos com ferramentas foram concluidos. Os casos concluidos passaram nas checagens automaticas, mas a amostra nao permite concluir que o modelo seja melhor ou pior; a disponibilidade da API foi insuficiente nesta rodada.</w:t>
       </w:r>
     </w:p>
     <w:p>
@@ -4824,6 +4820,699 @@
         <w:t>Quando os dois provedores estiverem acessiveis, executar os mesmos casos em tres repeticoes; comparar medianas, acerto automatico e revisao humana. Manter custo como “nao medido” ate configurar tarifas e conferir o painel.</w:t>
       </w:r>
     </w:p>
+    <w:p>
+      <w:pPr>
+        <w:pStyle w:val="Heading1"/>
+      </w:pPr>
+      <w:r>
+        <w:t>Teste exploratorio do Gemma</w:t>
+      </w:r>
+    </w:p>
+    <w:p>
+      <w:r>
+        <w:t>O Gemma foi incluido como provedor separado, sem substituir a configuracao do Gemini. A chamada usou o modelo gemma-4-26b-a4b-it (variavel BENCH_GEMMA_MODEL) e a mesma GEMINI_API_KEY do Google AI Studio. O teste foi interrompido apos a primeira resposta HTTP 500.</w:t>
+      </w:r>
+    </w:p>
+    <w:tbl>
+      <w:tblPr>
+        <w:tblStyle w:val="TableGrid"/>
+        <w:tblW w:type="auto" w:w="0"/>
+        <w:tblLook w:firstColumn="1" w:firstRow="1" w:lastColumn="0" w:lastRow="0" w:noHBand="0" w:noVBand="1" w:val="04A0"/>
+      </w:tblPr>
+      <w:tblGrid>
+        <w:gridCol w:w="5083"/>
+        <w:gridCol w:w="5083"/>
+      </w:tblGrid>
+      <w:tr>
+        <w:tc>
+          <w:tcPr>
+            <w:tcW w:type="dxa" w:w="5083"/>
+          </w:tcPr>
+          <w:p>
+            <w:r>
+              <w:rPr>
+                <w:sz w:val="18"/>
+              </w:rPr>
+              <w:t>Registro</w:t>
+            </w:r>
+          </w:p>
+        </w:tc>
+        <w:tc>
+          <w:tcPr>
+            <w:tcW w:type="dxa" w:w="5083"/>
+          </w:tcPr>
+          <w:p>
+            <w:r>
+              <w:rPr>
+                <w:sz w:val="18"/>
+              </w:rPr>
+              <w:t>Resultado</w:t>
+            </w:r>
+          </w:p>
+        </w:tc>
+      </w:tr>
+      <w:tr>
+        <w:tc>
+          <w:tcPr>
+            <w:tcW w:type="dxa" w:w="5083"/>
+          </w:tcPr>
+          <w:p>
+            <w:r>
+              <w:rPr>
+                <w:sz w:val="18"/>
+              </w:rPr>
+              <w:t>Data e modo</w:t>
+            </w:r>
+          </w:p>
+        </w:tc>
+        <w:tc>
+          <w:tcPr>
+            <w:tcW w:type="dxa" w:w="5083"/>
+          </w:tcPr>
+          <w:p>
+            <w:r>
+              <w:rPr>
+                <w:sz w:val="18"/>
+              </w:rPr>
+              <w:t>27/10/2026; chamada com ferramentas; 1 caso e 1 repeticao.</w:t>
+            </w:r>
+          </w:p>
+        </w:tc>
+      </w:tr>
+      <w:tr>
+        <w:tc>
+          <w:tcPr>
+            <w:tcW w:type="dxa" w:w="5083"/>
+          </w:tcPr>
+          <w:p>
+            <w:r>
+              <w:rPr>
+                <w:sz w:val="18"/>
+              </w:rPr>
+              <w:t>Caso</w:t>
+            </w:r>
+          </w:p>
+        </w:tc>
+        <w:tc>
+          <w:tcPr>
+            <w:tcW w:type="dxa" w:w="5083"/>
+          </w:tcPr>
+          <w:p>
+            <w:r>
+              <w:rPr>
+                <w:sz w:val="18"/>
+              </w:rPr>
+              <w:t>estoque_savassi.</w:t>
+            </w:r>
+          </w:p>
+        </w:tc>
+      </w:tr>
+      <w:tr>
+        <w:tc>
+          <w:tcPr>
+            <w:tcW w:type="dxa" w:w="5083"/>
+          </w:tcPr>
+          <w:p>
+            <w:r>
+              <w:rPr>
+                <w:sz w:val="18"/>
+              </w:rPr>
+              <w:t>Latencia observada</w:t>
+            </w:r>
+          </w:p>
+        </w:tc>
+        <w:tc>
+          <w:tcPr>
+            <w:tcW w:type="dxa" w:w="5083"/>
+          </w:tcPr>
+          <w:p>
+            <w:r>
+              <w:rPr>
+                <w:sz w:val="18"/>
+              </w:rPr>
+              <w:t>34.305 ms.</w:t>
+            </w:r>
+          </w:p>
+        </w:tc>
+      </w:tr>
+      <w:tr>
+        <w:tc>
+          <w:tcPr>
+            <w:tcW w:type="dxa" w:w="5083"/>
+          </w:tcPr>
+          <w:p>
+            <w:r>
+              <w:rPr>
+                <w:sz w:val="18"/>
+              </w:rPr>
+              <w:t>Resposta da API</w:t>
+            </w:r>
+          </w:p>
+        </w:tc>
+        <w:tc>
+          <w:tcPr>
+            <w:tcW w:type="dxa" w:w="5083"/>
+          </w:tcPr>
+          <w:p>
+            <w:r>
+              <w:rPr>
+                <w:sz w:val="18"/>
+              </w:rPr>
+              <w:t>HTTP 500; sem resposta valida e sem chamadas de ferramenta registradas.</w:t>
+            </w:r>
+          </w:p>
+        </w:tc>
+      </w:tr>
+      <w:tr>
+        <w:tc>
+          <w:tcPr>
+            <w:tcW w:type="dxa" w:w="5083"/>
+          </w:tcPr>
+          <w:p>
+            <w:r>
+              <w:rPr>
+                <w:sz w:val="18"/>
+              </w:rPr>
+              <w:t>Tokens e custo</w:t>
+            </w:r>
+          </w:p>
+        </w:tc>
+        <w:tc>
+          <w:tcPr>
+            <w:tcW w:type="dxa" w:w="5083"/>
+          </w:tcPr>
+          <w:p>
+            <w:r>
+              <w:rPr>
+                <w:sz w:val="18"/>
+              </w:rPr>
+              <w:t>Nao informados no CSV; verificar o painel de uso antes de qualquer nova tentativa.</w:t>
+            </w:r>
+          </w:p>
+        </w:tc>
+      </w:tr>
+      <w:tr>
+        <w:tc>
+          <w:tcPr>
+            <w:tcW w:type="dxa" w:w="5083"/>
+          </w:tcPr>
+          <w:p>
+            <w:r>
+              <w:rPr>
+                <w:sz w:val="18"/>
+              </w:rPr>
+              <w:t>CSV</w:t>
+            </w:r>
+          </w:p>
+        </w:tc>
+        <w:tc>
+          <w:tcPr>
+            <w:tcW w:type="dxa" w:w="5083"/>
+          </w:tcPr>
+          <w:p>
+            <w:r>
+              <w:rPr>
+                <w:sz w:val="18"/>
+              </w:rPr>
+              <w:t>scripts/benchmark_chatbot/resultados/ferramentas-20261027-105413-429594.csv.</w:t>
+            </w:r>
+          </w:p>
+        </w:tc>
+      </w:tr>
+    </w:tbl>
+    <w:p>
+      <w:r>
+        <w:t>Interpretacao: este resultado e inconclusivo. Um HTTP 500 nao demonstra que o Gemma seja pior nem melhor; apenas indica que esta chamada nao concluiu. Nao foram executados baseline ou os demais casos, e nao ha metricas de acerto, tokens ou custo para comparar. As chamadas adicionais foram suspensas para evitar novas tentativas sem antes conferir o painel de uso/quota.</w:t>
+      </w:r>
+    </w:p>
+    <w:p>
+      <w:pPr>
+        <w:pStyle w:val="Heading1"/>
+      </w:pPr>
+      <w:r>
+        <w:t>Verificacao diagnostica posterior</w:t>
+      </w:r>
+    </w:p>
+    <w:p>
+      <w:r>
+        <w:t>Apos o HTTP 500, foi feita uma unica chamada REST diagnostica com o mesmo modelo, caso, prompt e declaracoes de ferramentas. A API respondeu HTTP 200 e retornou uma chamada de funcao valida. A funcao local nao foi executada e nao houve segundo turno, portanto isto confirma somente que a requisicao inicial foi aceita nessa tentativa; nao completa o caso nem substitui o benchmark. O sucesso posterior torna provavel uma falha transitoria no servico no primeiro teste, mas nao recupera a mensagem detalhada daquele HTTP 500.</w:t>
+      </w:r>
+    </w:p>
+    <w:tbl>
+      <w:tblPr>
+        <w:tblStyle w:val="TableGrid"/>
+        <w:tblW w:type="auto" w:w="0"/>
+        <w:tblLook w:firstColumn="1" w:firstRow="1" w:lastColumn="0" w:lastRow="0" w:noHBand="0" w:noVBand="1" w:val="04A0"/>
+      </w:tblPr>
+      <w:tblGrid>
+        <w:gridCol w:w="5083"/>
+        <w:gridCol w:w="5083"/>
+      </w:tblGrid>
+      <w:tr>
+        <w:tc>
+          <w:tcPr>
+            <w:tcW w:type="dxa" w:w="5083"/>
+          </w:tcPr>
+          <w:p>
+            <w:r>
+              <w:rPr>
+                <w:sz w:val="18"/>
+              </w:rPr>
+              <w:t>Registro</w:t>
+            </w:r>
+          </w:p>
+        </w:tc>
+        <w:tc>
+          <w:tcPr>
+            <w:tcW w:type="dxa" w:w="5083"/>
+          </w:tcPr>
+          <w:p>
+            <w:r>
+              <w:rPr>
+                <w:sz w:val="18"/>
+              </w:rPr>
+              <w:t>Resultado</w:t>
+            </w:r>
+          </w:p>
+        </w:tc>
+      </w:tr>
+      <w:tr>
+        <w:tc>
+          <w:tcPr>
+            <w:tcW w:type="dxa" w:w="5083"/>
+          </w:tcPr>
+          <w:p>
+            <w:r>
+              <w:rPr>
+                <w:sz w:val="18"/>
+              </w:rPr>
+              <w:t>Modelo e caso</w:t>
+            </w:r>
+          </w:p>
+        </w:tc>
+        <w:tc>
+          <w:tcPr>
+            <w:tcW w:type="dxa" w:w="5083"/>
+          </w:tcPr>
+          <w:p>
+            <w:r>
+              <w:rPr>
+                <w:sz w:val="18"/>
+              </w:rPr>
+              <w:t>gemma-4-26b-a4b-it; estoque_savassi; chamada com ferramentas.</w:t>
+            </w:r>
+          </w:p>
+        </w:tc>
+      </w:tr>
+      <w:tr>
+        <w:tc>
+          <w:tcPr>
+            <w:tcW w:type="dxa" w:w="5083"/>
+          </w:tcPr>
+          <w:p>
+            <w:r>
+              <w:rPr>
+                <w:sz w:val="18"/>
+              </w:rPr>
+              <w:t>Resposta</w:t>
+            </w:r>
+          </w:p>
+        </w:tc>
+        <w:tc>
+          <w:tcPr>
+            <w:tcW w:type="dxa" w:w="5083"/>
+          </w:tcPr>
+          <w:p>
+            <w:r>
+              <w:rPr>
+                <w:sz w:val="18"/>
+              </w:rPr>
+              <w:t>HTTP 200; uma chamada de funcao retornada; sem execucao da funcao/segundo turno.</w:t>
+            </w:r>
+          </w:p>
+        </w:tc>
+      </w:tr>
+      <w:tr>
+        <w:tc>
+          <w:tcPr>
+            <w:tcW w:type="dxa" w:w="5083"/>
+          </w:tcPr>
+          <w:p>
+            <w:r>
+              <w:rPr>
+                <w:sz w:val="18"/>
+              </w:rPr>
+              <w:t>Uso informado pela API</w:t>
+            </w:r>
+          </w:p>
+        </w:tc>
+        <w:tc>
+          <w:tcPr>
+            <w:tcW w:type="dxa" w:w="5083"/>
+          </w:tcPr>
+          <w:p>
+            <w:r>
+              <w:rPr>
+                <w:sz w:val="18"/>
+              </w:rPr>
+              <w:t>366 tokens de entrada; 28 tokens de candidato; 110 tokens de pensamento; 504 tokens totais.</w:t>
+            </w:r>
+          </w:p>
+        </w:tc>
+      </w:tr>
+      <w:tr>
+        <w:tc>
+          <w:tcPr>
+            <w:tcW w:type="dxa" w:w="5083"/>
+          </w:tcPr>
+          <w:p>
+            <w:r>
+              <w:rPr>
+                <w:sz w:val="18"/>
+              </w:rPr>
+              <w:t>Identificador</w:t>
+            </w:r>
+          </w:p>
+        </w:tc>
+        <w:tc>
+          <w:tcPr>
+            <w:tcW w:type="dxa" w:w="5083"/>
+          </w:tcPr>
+          <w:p>
+            <w:r>
+              <w:rPr>
+                <w:sz w:val="18"/>
+              </w:rPr>
+              <w:t>A resposta nao forneceu request ID nos cabecalhos consultados.</w:t>
+            </w:r>
+          </w:p>
+        </w:tc>
+      </w:tr>
+      <w:tr>
+        <w:tc>
+          <w:tcPr>
+            <w:tcW w:type="dxa" w:w="5083"/>
+          </w:tcPr>
+          <w:p>
+            <w:r>
+              <w:rPr>
+                <w:sz w:val="18"/>
+              </w:rPr>
+              <w:t>Custo</w:t>
+            </w:r>
+          </w:p>
+        </w:tc>
+        <w:tc>
+          <w:tcPr>
+            <w:tcW w:type="dxa" w:w="5083"/>
+          </w:tcPr>
+          <w:p>
+            <w:r>
+              <w:rPr>
+                <w:sz w:val="18"/>
+              </w:rPr>
+              <w:t>Nao calculado; conferir o painel Google AI Studio antes de novos testes.</w:t>
+            </w:r>
+          </w:p>
+        </w:tc>
+      </w:tr>
+    </w:tbl>
+    <w:p>
+      <w:pPr>
+        <w:pStyle w:val="Heading1"/>
+      </w:pPr>
+      <w:r>
+        <w:t>Bateria comparativa exploratoria do Gemma</w:t>
+      </w:r>
+    </w:p>
+    <w:p>
+      <w:r>
+        <w:t>Em 27/10/2026, o mesmo conjunto de 12 casos ficticios foi executado uma vez no baseline e uma vez no modo com ferramentas. Os percentuais abaixo separam casos concluidos de falhas tecnicas; nao devem ser comparados como se todos os 12 casos tivessem recebido resposta.</w:t>
+      </w:r>
+    </w:p>
+    <w:tbl>
+      <w:tblPr>
+        <w:tblStyle w:val="TableGrid"/>
+        <w:tblW w:type="auto" w:w="0"/>
+        <w:tblLook w:firstColumn="1" w:firstRow="1" w:lastColumn="0" w:lastRow="0" w:noHBand="0" w:noVBand="1" w:val="04A0"/>
+      </w:tblPr>
+      <w:tblGrid>
+        <w:gridCol w:w="5083"/>
+        <w:gridCol w:w="5083"/>
+      </w:tblGrid>
+      <w:tr>
+        <w:tc>
+          <w:tcPr>
+            <w:tcW w:type="dxa" w:w="5083"/>
+          </w:tcPr>
+          <w:p>
+            <w:r>
+              <w:rPr>
+                <w:sz w:val="18"/>
+              </w:rPr>
+              <w:t>Indicador</w:t>
+            </w:r>
+          </w:p>
+        </w:tc>
+        <w:tc>
+          <w:tcPr>
+            <w:tcW w:type="dxa" w:w="5083"/>
+          </w:tcPr>
+          <w:p>
+            <w:r>
+              <w:rPr>
+                <w:sz w:val="18"/>
+              </w:rPr>
+              <w:t>Resultado</w:t>
+            </w:r>
+          </w:p>
+        </w:tc>
+      </w:tr>
+      <w:tr>
+        <w:tc>
+          <w:tcPr>
+            <w:tcW w:type="dxa" w:w="5083"/>
+          </w:tcPr>
+          <w:p>
+            <w:r>
+              <w:rPr>
+                <w:sz w:val="18"/>
+              </w:rPr>
+              <w:t>Baseline</w:t>
+            </w:r>
+          </w:p>
+        </w:tc>
+        <w:tc>
+          <w:tcPr>
+            <w:tcW w:type="dxa" w:w="5083"/>
+          </w:tcPr>
+          <w:p>
+            <w:r>
+              <w:rPr>
+                <w:sz w:val="18"/>
+              </w:rPr>
+              <w:t>7/12 casos concluidos; 7/7 passaram na checagem automatica. Falhas: 4 HTTP 500 e 1 timeout.</w:t>
+            </w:r>
+          </w:p>
+        </w:tc>
+      </w:tr>
+      <w:tr>
+        <w:tc>
+          <w:tcPr>
+            <w:tcW w:type="dxa" w:w="5083"/>
+          </w:tcPr>
+          <w:p>
+            <w:r>
+              <w:rPr>
+                <w:sz w:val="18"/>
+              </w:rPr>
+              <w:t>Latencia baseline</w:t>
+            </w:r>
+          </w:p>
+        </w:tc>
+        <w:tc>
+          <w:tcPr>
+            <w:tcW w:type="dxa" w:w="5083"/>
+          </w:tcPr>
+          <w:p>
+            <w:r>
+              <w:rPr>
+                <w:sz w:val="18"/>
+              </w:rPr>
+              <w:t>Mediana dos 7 casos concluidos: 15.829 ms. Tokens reportados nesses casos: 2.192 entrada e 125 saida.</w:t>
+            </w:r>
+          </w:p>
+        </w:tc>
+      </w:tr>
+      <w:tr>
+        <w:tc>
+          <w:tcPr>
+            <w:tcW w:type="dxa" w:w="5083"/>
+          </w:tcPr>
+          <w:p>
+            <w:r>
+              <w:rPr>
+                <w:sz w:val="18"/>
+              </w:rPr>
+              <w:t>Com ferramentas</w:t>
+            </w:r>
+          </w:p>
+        </w:tc>
+        <w:tc>
+          <w:tcPr>
+            <w:tcW w:type="dxa" w:w="5083"/>
+          </w:tcPr>
+          <w:p>
+            <w:r>
+              <w:rPr>
+                <w:sz w:val="18"/>
+              </w:rPr>
+              <w:t>1/12 caso concluido; o caso sku_sem_dado selecionou a funcao esperada e passou na checagem automatica. Falhas nos outros casos: 8 HTTP 500, 1 HTTP 503 e 2 timeouts.</w:t>
+            </w:r>
+          </w:p>
+        </w:tc>
+      </w:tr>
+      <w:tr>
+        <w:tc>
+          <w:tcPr>
+            <w:tcW w:type="dxa" w:w="5083"/>
+          </w:tcPr>
+          <w:p>
+            <w:r>
+              <w:rPr>
+                <w:sz w:val="18"/>
+              </w:rPr>
+              <w:t>Latencia com ferramentas</w:t>
+            </w:r>
+          </w:p>
+        </w:tc>
+        <w:tc>
+          <w:tcPr>
+            <w:tcW w:type="dxa" w:w="5083"/>
+          </w:tcPr>
+          <w:p>
+            <w:r>
+              <w:rPr>
+                <w:sz w:val="18"/>
+              </w:rPr>
+              <w:t>49.655 ms no unico caso concluido; nao e uma mediana representativa. Tokens reportados: 1.020 entrada e 44 saida.</w:t>
+            </w:r>
+          </w:p>
+        </w:tc>
+      </w:tr>
+      <w:tr>
+        <w:tc>
+          <w:tcPr>
+            <w:tcW w:type="dxa" w:w="5083"/>
+          </w:tcPr>
+          <w:p>
+            <w:r>
+              <w:rPr>
+                <w:sz w:val="18"/>
+              </w:rPr>
+              <w:t>Limites e custo</w:t>
+            </w:r>
+          </w:p>
+        </w:tc>
+        <w:tc>
+          <w:tcPr>
+            <w:tcW w:type="dxa" w:w="5083"/>
+          </w:tcPr>
+          <w:p>
+            <w:r>
+              <w:rPr>
+                <w:sz w:val="18"/>
+              </w:rPr>
+              <w:t>Nenhum 429 foi registrado. O custo nao foi calculado; falhas tecnicas podem nao trazer metadados de uso. Conferir o painel do Google AI Studio.</w:t>
+            </w:r>
+          </w:p>
+        </w:tc>
+      </w:tr>
+      <w:tr>
+        <w:tc>
+          <w:tcPr>
+            <w:tcW w:type="dxa" w:w="5083"/>
+          </w:tcPr>
+          <w:p>
+            <w:r>
+              <w:rPr>
+                <w:sz w:val="18"/>
+              </w:rPr>
+              <w:t>Interpretacao</w:t>
+            </w:r>
+          </w:p>
+        </w:tc>
+        <w:tc>
+          <w:tcPr>
+            <w:tcW w:type="dxa" w:w="5083"/>
+          </w:tcPr>
+          <w:p>
+            <w:r>
+              <w:rPr>
+                <w:sz w:val="18"/>
+              </w:rPr>
+              <w:t>O principal achado desta rodada e instabilidade da API (HTTP 500/503 e timeouts), nao baixa precisao demonstrada. Os acertos concluidos sao poucos para avaliar eficacia. Nao concluir que o Gemma e melhor que Gemini ou Groq.</w:t>
+            </w:r>
+          </w:p>
+        </w:tc>
+      </w:tr>
+      <w:tr>
+        <w:tc>
+          <w:tcPr>
+            <w:tcW w:type="dxa" w:w="5083"/>
+          </w:tcPr>
+          <w:p>
+            <w:r>
+              <w:rPr>
+                <w:sz w:val="18"/>
+              </w:rPr>
+              <w:t>Observacao qualitativa</w:t>
+            </w:r>
+          </w:p>
+        </w:tc>
+        <w:tc>
+          <w:tcPr>
+            <w:tcW w:type="dxa" w:w="5083"/>
+          </w:tcPr>
+          <w:p>
+            <w:r>
+              <w:rPr>
+                <w:sz w:val="18"/>
+              </w:rPr>
+              <w:t>Nas respostas baseline concluidas, houve texto muito mais longo que o pedido de brevidade, incluindo conteudo em formato de analise antes da resposta final. Isso precisa de revisao humana para uso em atendimento.</w:t>
+            </w:r>
+          </w:p>
+        </w:tc>
+      </w:tr>
+      <w:tr>
+        <w:tc>
+          <w:tcPr>
+            <w:tcW w:type="dxa" w:w="5083"/>
+          </w:tcPr>
+          <w:p>
+            <w:r>
+              <w:rPr>
+                <w:sz w:val="18"/>
+              </w:rPr>
+              <w:t>Arquivos</w:t>
+            </w:r>
+          </w:p>
+        </w:tc>
+        <w:tc>
+          <w:tcPr>
+            <w:tcW w:type="dxa" w:w="5083"/>
+          </w:tcPr>
+          <w:p>
+            <w:r>
+              <w:rPr>
+                <w:sz w:val="18"/>
+              </w:rPr>
+              <w:t>baseline-20261027-141557-665362.csv; ferramentas-20261027-142028-377174.csv, em scripts/benchmark_chatbot/resultados/.</w:t>
+            </w:r>
+          </w:p>
+        </w:tc>
+      </w:tr>
+    </w:tbl>
     <w:sectPr>
       <w:footerReference w:type="default" r:id="rId9"/>
       <w:pgSz w:w="12240" w:h="15840"/>

</xml_diff>